<commit_message>
clarify baseline power averages and LSP provenance
</commit_message>
<xml_diff>
--- a/LightGenV2/reports/20260927_demo_energy_efficiency_a100/A100_demo_energy_efficiency_methods.docx
+++ b/LightGenV2/reports/20260927_demo_energy_efficiency_a100/A100_demo_energy_efficiency_methods.docx
@@ -102,6 +102,1016 @@
           <w:b/>
         </w:rPr>
         <w:t>速度提升 = tBaseline / tOurs；能效提升 = EBaseline / EOurs；能量降低 = 1 − EOurs / EBaseline。</w:t>
+      </w:r>
+    </w:p>
+    <w:p>
+      <w:pPr>
+        <w:pStyle w:val="Heading2"/>
+      </w:pPr>
+      <w:r>
+        <w:t>Baseline A100 活跃阶段平均功率</w:t>
+      </w:r>
+    </w:p>
+    <w:tbl>
+      <w:tblPr>
+        <w:tblStyle w:val="TableGrid"/>
+        <w:tblW w:type="auto" w:w="0"/>
+        <w:tblLook w:firstColumn="1" w:firstRow="1" w:lastColumn="0" w:lastRow="0" w:noHBand="0" w:noVBand="1" w:val="04A0"/>
+      </w:tblPr>
+      <w:tblGrid>
+        <w:gridCol w:w="1700"/>
+        <w:gridCol w:w="1700"/>
+        <w:gridCol w:w="1700"/>
+        <w:gridCol w:w="1700"/>
+        <w:gridCol w:w="1700"/>
+        <w:gridCol w:w="1700"/>
+      </w:tblGrid>
+      <w:tr>
+        <w:tc>
+          <w:tcPr>
+            <w:tcW w:type="dxa" w:w="1700"/>
+            <w:vAlign w:val="center"/>
+            <w:shd w:fill="0B5A88"/>
+          </w:tcPr>
+          <w:p>
+            <w:pPr>
+              <w:jc w:val="center"/>
+            </w:pPr>
+            <w:r/>
+            <w:r>
+              <w:rPr>
+                <w:b/>
+                <w:color w:val="FFFFFF"/>
+                <w:sz w:val="16"/>
+              </w:rPr>
+              <w:t>序号</w:t>
+            </w:r>
+          </w:p>
+        </w:tc>
+        <w:tc>
+          <w:tcPr>
+            <w:tcW w:type="dxa" w:w="1700"/>
+            <w:vAlign w:val="center"/>
+            <w:shd w:fill="0B5A88"/>
+          </w:tcPr>
+          <w:p>
+            <w:pPr>
+              <w:jc w:val="center"/>
+            </w:pPr>
+            <w:r/>
+            <w:r>
+              <w:rPr>
+                <w:b/>
+                <w:color w:val="FFFFFF"/>
+                <w:sz w:val="16"/>
+              </w:rPr>
+              <w:t>任务</w:t>
+            </w:r>
+          </w:p>
+        </w:tc>
+        <w:tc>
+          <w:tcPr>
+            <w:tcW w:type="dxa" w:w="1700"/>
+            <w:vAlign w:val="center"/>
+            <w:shd w:fill="0B5A88"/>
+          </w:tcPr>
+          <w:p>
+            <w:pPr>
+              <w:jc w:val="center"/>
+            </w:pPr>
+            <w:r/>
+            <w:r>
+              <w:rPr>
+                <w:b/>
+                <w:color w:val="FFFFFF"/>
+                <w:sz w:val="16"/>
+              </w:rPr>
+              <w:t>A100均值/W</w:t>
+            </w:r>
+          </w:p>
+        </w:tc>
+        <w:tc>
+          <w:tcPr>
+            <w:tcW w:type="dxa" w:w="1700"/>
+            <w:vAlign w:val="center"/>
+            <w:shd w:fill="0B5A88"/>
+          </w:tcPr>
+          <w:p>
+            <w:pPr>
+              <w:jc w:val="center"/>
+            </w:pPr>
+            <w:r/>
+            <w:r>
+              <w:rPr>
+                <w:b/>
+                <w:color w:val="FFFFFF"/>
+                <w:sz w:val="16"/>
+              </w:rPr>
+              <w:t>机箱/W</w:t>
+            </w:r>
+          </w:p>
+        </w:tc>
+        <w:tc>
+          <w:tcPr>
+            <w:tcW w:type="dxa" w:w="1700"/>
+            <w:vAlign w:val="center"/>
+            <w:shd w:fill="0B5A88"/>
+          </w:tcPr>
+          <w:p>
+            <w:pPr>
+              <w:jc w:val="center"/>
+            </w:pPr>
+            <w:r/>
+            <w:r>
+              <w:rPr>
+                <w:b/>
+                <w:color w:val="FFFFFF"/>
+                <w:sz w:val="16"/>
+              </w:rPr>
+              <w:t>合计/W</w:t>
+            </w:r>
+          </w:p>
+        </w:tc>
+        <w:tc>
+          <w:tcPr>
+            <w:tcW w:type="dxa" w:w="1700"/>
+            <w:vAlign w:val="center"/>
+            <w:shd w:fill="0B5A88"/>
+          </w:tcPr>
+          <w:p>
+            <w:pPr>
+              <w:jc w:val="center"/>
+            </w:pPr>
+            <w:r/>
+            <w:r>
+              <w:rPr>
+                <w:b/>
+                <w:color w:val="FFFFFF"/>
+                <w:sz w:val="16"/>
+              </w:rPr>
+              <w:t>功率采样点</w:t>
+            </w:r>
+          </w:p>
+        </w:tc>
+      </w:tr>
+      <w:tr>
+        <w:tc>
+          <w:tcPr>
+            <w:tcW w:type="dxa" w:w="1700"/>
+            <w:vAlign w:val="center"/>
+            <w:shd w:fill="DCECF7"/>
+          </w:tcPr>
+          <w:p>
+            <w:pPr>
+              <w:jc w:val="center"/>
+            </w:pPr>
+            <w:r/>
+            <w:r>
+              <w:rPr>
+                <w:b w:val="0"/>
+                <w:sz w:val="16"/>
+              </w:rPr>
+              <w:t>01a</w:t>
+            </w:r>
+          </w:p>
+        </w:tc>
+        <w:tc>
+          <w:tcPr>
+            <w:tcW w:type="dxa" w:w="1700"/>
+            <w:vAlign w:val="center"/>
+            <w:shd w:fill="DCECF7"/>
+          </w:tcPr>
+          <w:p>
+            <w:pPr>
+              <w:jc w:val="center"/>
+            </w:pPr>
+            <w:r/>
+            <w:r>
+              <w:rPr>
+                <w:b w:val="0"/>
+                <w:sz w:val="16"/>
+              </w:rPr>
+              <w:t>LGVQ temporal quality</w:t>
+            </w:r>
+          </w:p>
+        </w:tc>
+        <w:tc>
+          <w:tcPr>
+            <w:tcW w:type="dxa" w:w="1700"/>
+            <w:vAlign w:val="center"/>
+            <w:shd w:fill="DCECF7"/>
+          </w:tcPr>
+          <w:p>
+            <w:pPr>
+              <w:jc w:val="center"/>
+            </w:pPr>
+            <w:r/>
+            <w:r>
+              <w:rPr>
+                <w:b w:val="0"/>
+                <w:sz w:val="16"/>
+              </w:rPr>
+              <w:t>50.658</w:t>
+            </w:r>
+          </w:p>
+        </w:tc>
+        <w:tc>
+          <w:tcPr>
+            <w:tcW w:type="dxa" w:w="1700"/>
+            <w:vAlign w:val="center"/>
+            <w:shd w:fill="DCECF7"/>
+          </w:tcPr>
+          <w:p>
+            <w:pPr>
+              <w:jc w:val="center"/>
+            </w:pPr>
+            <w:r/>
+            <w:r>
+              <w:rPr>
+                <w:b w:val="0"/>
+                <w:sz w:val="16"/>
+              </w:rPr>
+              <w:t>338.2</w:t>
+            </w:r>
+          </w:p>
+        </w:tc>
+        <w:tc>
+          <w:tcPr>
+            <w:tcW w:type="dxa" w:w="1700"/>
+            <w:vAlign w:val="center"/>
+            <w:shd w:fill="DCECF7"/>
+          </w:tcPr>
+          <w:p>
+            <w:pPr>
+              <w:jc w:val="center"/>
+            </w:pPr>
+            <w:r/>
+            <w:r>
+              <w:rPr>
+                <w:b w:val="0"/>
+                <w:sz w:val="16"/>
+              </w:rPr>
+              <w:t>388.858</w:t>
+            </w:r>
+          </w:p>
+        </w:tc>
+        <w:tc>
+          <w:tcPr>
+            <w:tcW w:type="dxa" w:w="1700"/>
+            <w:vAlign w:val="center"/>
+            <w:shd w:fill="DCECF7"/>
+          </w:tcPr>
+          <w:p>
+            <w:pPr>
+              <w:jc w:val="center"/>
+            </w:pPr>
+            <w:r/>
+            <w:r>
+              <w:rPr>
+                <w:b w:val="0"/>
+                <w:sz w:val="16"/>
+              </w:rPr>
+              <w:t>322</w:t>
+            </w:r>
+          </w:p>
+        </w:tc>
+      </w:tr>
+      <w:tr>
+        <w:tc>
+          <w:tcPr>
+            <w:tcW w:type="dxa" w:w="1700"/>
+            <w:vAlign w:val="center"/>
+            <w:shd w:fill="E7EAED"/>
+          </w:tcPr>
+          <w:p>
+            <w:pPr>
+              <w:jc w:val="center"/>
+            </w:pPr>
+            <w:r/>
+            <w:r>
+              <w:rPr>
+                <w:b w:val="0"/>
+                <w:sz w:val="16"/>
+              </w:rPr>
+              <w:t>01b</w:t>
+            </w:r>
+          </w:p>
+        </w:tc>
+        <w:tc>
+          <w:tcPr>
+            <w:tcW w:type="dxa" w:w="1700"/>
+            <w:vAlign w:val="center"/>
+            <w:shd w:fill="E7EAED"/>
+          </w:tcPr>
+          <w:p>
+            <w:pPr>
+              <w:jc w:val="center"/>
+            </w:pPr>
+            <w:r/>
+            <w:r>
+              <w:rPr>
+                <w:b w:val="0"/>
+                <w:sz w:val="16"/>
+              </w:rPr>
+              <w:t>LGVQ spatial quality</w:t>
+            </w:r>
+          </w:p>
+        </w:tc>
+        <w:tc>
+          <w:tcPr>
+            <w:tcW w:type="dxa" w:w="1700"/>
+            <w:vAlign w:val="center"/>
+            <w:shd w:fill="E7EAED"/>
+          </w:tcPr>
+          <w:p>
+            <w:pPr>
+              <w:jc w:val="center"/>
+            </w:pPr>
+            <w:r/>
+            <w:r>
+              <w:rPr>
+                <w:b w:val="0"/>
+                <w:sz w:val="16"/>
+              </w:rPr>
+              <w:t>51.999</w:t>
+            </w:r>
+          </w:p>
+        </w:tc>
+        <w:tc>
+          <w:tcPr>
+            <w:tcW w:type="dxa" w:w="1700"/>
+            <w:vAlign w:val="center"/>
+            <w:shd w:fill="E7EAED"/>
+          </w:tcPr>
+          <w:p>
+            <w:pPr>
+              <w:jc w:val="center"/>
+            </w:pPr>
+            <w:r/>
+            <w:r>
+              <w:rPr>
+                <w:b w:val="0"/>
+                <w:sz w:val="16"/>
+              </w:rPr>
+              <w:t>338.2</w:t>
+            </w:r>
+          </w:p>
+        </w:tc>
+        <w:tc>
+          <w:tcPr>
+            <w:tcW w:type="dxa" w:w="1700"/>
+            <w:vAlign w:val="center"/>
+            <w:shd w:fill="E7EAED"/>
+          </w:tcPr>
+          <w:p>
+            <w:pPr>
+              <w:jc w:val="center"/>
+            </w:pPr>
+            <w:r/>
+            <w:r>
+              <w:rPr>
+                <w:b w:val="0"/>
+                <w:sz w:val="16"/>
+              </w:rPr>
+              <w:t>390.199</w:t>
+            </w:r>
+          </w:p>
+        </w:tc>
+        <w:tc>
+          <w:tcPr>
+            <w:tcW w:type="dxa" w:w="1700"/>
+            <w:vAlign w:val="center"/>
+            <w:shd w:fill="E7EAED"/>
+          </w:tcPr>
+          <w:p>
+            <w:pPr>
+              <w:jc w:val="center"/>
+            </w:pPr>
+            <w:r/>
+            <w:r>
+              <w:rPr>
+                <w:b w:val="0"/>
+                <w:sz w:val="16"/>
+              </w:rPr>
+              <w:t>319</w:t>
+            </w:r>
+          </w:p>
+        </w:tc>
+      </w:tr>
+      <w:tr>
+        <w:tc>
+          <w:tcPr>
+            <w:tcW w:type="dxa" w:w="1700"/>
+            <w:vAlign w:val="center"/>
+            <w:shd w:fill="DCECF7"/>
+          </w:tcPr>
+          <w:p>
+            <w:pPr>
+              <w:jc w:val="center"/>
+            </w:pPr>
+            <w:r/>
+            <w:r>
+              <w:rPr>
+                <w:b w:val="0"/>
+                <w:sz w:val="16"/>
+              </w:rPr>
+              <w:t>02</w:t>
+            </w:r>
+          </w:p>
+        </w:tc>
+        <w:tc>
+          <w:tcPr>
+            <w:tcW w:type="dxa" w:w="1700"/>
+            <w:vAlign w:val="center"/>
+            <w:shd w:fill="DCECF7"/>
+          </w:tcPr>
+          <w:p>
+            <w:pPr>
+              <w:jc w:val="center"/>
+            </w:pPr>
+            <w:r/>
+            <w:r>
+              <w:rPr>
+                <w:b w:val="0"/>
+                <w:sz w:val="16"/>
+              </w:rPr>
+              <w:t>ABO image-to-text retrieval</w:t>
+            </w:r>
+          </w:p>
+        </w:tc>
+        <w:tc>
+          <w:tcPr>
+            <w:tcW w:type="dxa" w:w="1700"/>
+            <w:vAlign w:val="center"/>
+            <w:shd w:fill="DCECF7"/>
+          </w:tcPr>
+          <w:p>
+            <w:pPr>
+              <w:jc w:val="center"/>
+            </w:pPr>
+            <w:r/>
+            <w:r>
+              <w:rPr>
+                <w:b w:val="0"/>
+                <w:sz w:val="16"/>
+              </w:rPr>
+              <w:t>78.951</w:t>
+            </w:r>
+          </w:p>
+        </w:tc>
+        <w:tc>
+          <w:tcPr>
+            <w:tcW w:type="dxa" w:w="1700"/>
+            <w:vAlign w:val="center"/>
+            <w:shd w:fill="DCECF7"/>
+          </w:tcPr>
+          <w:p>
+            <w:pPr>
+              <w:jc w:val="center"/>
+            </w:pPr>
+            <w:r/>
+            <w:r>
+              <w:rPr>
+                <w:b w:val="0"/>
+                <w:sz w:val="16"/>
+              </w:rPr>
+              <w:t>338.2</w:t>
+            </w:r>
+          </w:p>
+        </w:tc>
+        <w:tc>
+          <w:tcPr>
+            <w:tcW w:type="dxa" w:w="1700"/>
+            <w:vAlign w:val="center"/>
+            <w:shd w:fill="DCECF7"/>
+          </w:tcPr>
+          <w:p>
+            <w:pPr>
+              <w:jc w:val="center"/>
+            </w:pPr>
+            <w:r/>
+            <w:r>
+              <w:rPr>
+                <w:b w:val="0"/>
+                <w:sz w:val="16"/>
+              </w:rPr>
+              <w:t>417.151</w:t>
+            </w:r>
+          </w:p>
+        </w:tc>
+        <w:tc>
+          <w:tcPr>
+            <w:tcW w:type="dxa" w:w="1700"/>
+            <w:vAlign w:val="center"/>
+            <w:shd w:fill="DCECF7"/>
+          </w:tcPr>
+          <w:p>
+            <w:pPr>
+              <w:jc w:val="center"/>
+            </w:pPr>
+            <w:r/>
+            <w:r>
+              <w:rPr>
+                <w:b w:val="0"/>
+                <w:sz w:val="16"/>
+              </w:rPr>
+              <w:t>1464</w:t>
+            </w:r>
+          </w:p>
+        </w:tc>
+      </w:tr>
+      <w:tr>
+        <w:tc>
+          <w:tcPr>
+            <w:tcW w:type="dxa" w:w="1700"/>
+            <w:vAlign w:val="center"/>
+            <w:shd w:fill="E7EAED"/>
+          </w:tcPr>
+          <w:p>
+            <w:pPr>
+              <w:jc w:val="center"/>
+            </w:pPr>
+            <w:r/>
+            <w:r>
+              <w:rPr>
+                <w:b w:val="0"/>
+                <w:sz w:val="16"/>
+              </w:rPr>
+              <w:t>03</w:t>
+            </w:r>
+          </w:p>
+        </w:tc>
+        <w:tc>
+          <w:tcPr>
+            <w:tcW w:type="dxa" w:w="1700"/>
+            <w:vAlign w:val="center"/>
+            <w:shd w:fill="E7EAED"/>
+          </w:tcPr>
+          <w:p>
+            <w:pPr>
+              <w:jc w:val="center"/>
+            </w:pPr>
+            <w:r/>
+            <w:r>
+              <w:rPr>
+                <w:b w:val="0"/>
+                <w:sz w:val="16"/>
+              </w:rPr>
+              <w:t>ABO image-to-image retrieval</w:t>
+            </w:r>
+          </w:p>
+        </w:tc>
+        <w:tc>
+          <w:tcPr>
+            <w:tcW w:type="dxa" w:w="1700"/>
+            <w:vAlign w:val="center"/>
+            <w:shd w:fill="E7EAED"/>
+          </w:tcPr>
+          <w:p>
+            <w:pPr>
+              <w:jc w:val="center"/>
+            </w:pPr>
+            <w:r/>
+            <w:r>
+              <w:rPr>
+                <w:b w:val="0"/>
+                <w:sz w:val="16"/>
+              </w:rPr>
+              <w:t>85.759</w:t>
+            </w:r>
+          </w:p>
+        </w:tc>
+        <w:tc>
+          <w:tcPr>
+            <w:tcW w:type="dxa" w:w="1700"/>
+            <w:vAlign w:val="center"/>
+            <w:shd w:fill="E7EAED"/>
+          </w:tcPr>
+          <w:p>
+            <w:pPr>
+              <w:jc w:val="center"/>
+            </w:pPr>
+            <w:r/>
+            <w:r>
+              <w:rPr>
+                <w:b w:val="0"/>
+                <w:sz w:val="16"/>
+              </w:rPr>
+              <w:t>338.2</w:t>
+            </w:r>
+          </w:p>
+        </w:tc>
+        <w:tc>
+          <w:tcPr>
+            <w:tcW w:type="dxa" w:w="1700"/>
+            <w:vAlign w:val="center"/>
+            <w:shd w:fill="E7EAED"/>
+          </w:tcPr>
+          <w:p>
+            <w:pPr>
+              <w:jc w:val="center"/>
+            </w:pPr>
+            <w:r/>
+            <w:r>
+              <w:rPr>
+                <w:b w:val="0"/>
+                <w:sz w:val="16"/>
+              </w:rPr>
+              <w:t>423.959</w:t>
+            </w:r>
+          </w:p>
+        </w:tc>
+        <w:tc>
+          <w:tcPr>
+            <w:tcW w:type="dxa" w:w="1700"/>
+            <w:vAlign w:val="center"/>
+            <w:shd w:fill="E7EAED"/>
+          </w:tcPr>
+          <w:p>
+            <w:pPr>
+              <w:jc w:val="center"/>
+            </w:pPr>
+            <w:r/>
+            <w:r>
+              <w:rPr>
+                <w:b w:val="0"/>
+                <w:sz w:val="16"/>
+              </w:rPr>
+              <w:t>1464</w:t>
+            </w:r>
+          </w:p>
+        </w:tc>
+      </w:tr>
+      <w:tr>
+        <w:tc>
+          <w:tcPr>
+            <w:tcW w:type="dxa" w:w="1700"/>
+            <w:vAlign w:val="center"/>
+            <w:shd w:fill="DCECF7"/>
+          </w:tcPr>
+          <w:p>
+            <w:pPr>
+              <w:jc w:val="center"/>
+            </w:pPr>
+            <w:r/>
+            <w:r>
+              <w:rPr>
+                <w:b w:val="0"/>
+                <w:sz w:val="16"/>
+              </w:rPr>
+              <w:t>05</w:t>
+            </w:r>
+          </w:p>
+        </w:tc>
+        <w:tc>
+          <w:tcPr>
+            <w:tcW w:type="dxa" w:w="1700"/>
+            <w:vAlign w:val="center"/>
+            <w:shd w:fill="DCECF7"/>
+          </w:tcPr>
+          <w:p>
+            <w:pPr>
+              <w:jc w:val="center"/>
+            </w:pPr>
+            <w:r/>
+            <w:r>
+              <w:rPr>
+                <w:b w:val="0"/>
+                <w:sz w:val="16"/>
+              </w:rPr>
+              <w:t>LSP keypoint detection</w:t>
+            </w:r>
+          </w:p>
+        </w:tc>
+        <w:tc>
+          <w:tcPr>
+            <w:tcW w:type="dxa" w:w="1700"/>
+            <w:vAlign w:val="center"/>
+            <w:shd w:fill="DCECF7"/>
+          </w:tcPr>
+          <w:p>
+            <w:pPr>
+              <w:jc w:val="center"/>
+            </w:pPr>
+            <w:r/>
+            <w:r>
+              <w:rPr>
+                <w:b w:val="0"/>
+                <w:sz w:val="16"/>
+              </w:rPr>
+              <w:t>63.587</w:t>
+            </w:r>
+          </w:p>
+        </w:tc>
+        <w:tc>
+          <w:tcPr>
+            <w:tcW w:type="dxa" w:w="1700"/>
+            <w:vAlign w:val="center"/>
+            <w:shd w:fill="DCECF7"/>
+          </w:tcPr>
+          <w:p>
+            <w:pPr>
+              <w:jc w:val="center"/>
+            </w:pPr>
+            <w:r/>
+            <w:r>
+              <w:rPr>
+                <w:b w:val="0"/>
+                <w:sz w:val="16"/>
+              </w:rPr>
+              <w:t>338.2</w:t>
+            </w:r>
+          </w:p>
+        </w:tc>
+        <w:tc>
+          <w:tcPr>
+            <w:tcW w:type="dxa" w:w="1700"/>
+            <w:vAlign w:val="center"/>
+            <w:shd w:fill="DCECF7"/>
+          </w:tcPr>
+          <w:p>
+            <w:pPr>
+              <w:jc w:val="center"/>
+            </w:pPr>
+            <w:r/>
+            <w:r>
+              <w:rPr>
+                <w:b w:val="0"/>
+                <w:sz w:val="16"/>
+              </w:rPr>
+              <w:t>401.787</w:t>
+            </w:r>
+          </w:p>
+        </w:tc>
+        <w:tc>
+          <w:tcPr>
+            <w:tcW w:type="dxa" w:w="1700"/>
+            <w:vAlign w:val="center"/>
+            <w:shd w:fill="DCECF7"/>
+          </w:tcPr>
+          <w:p>
+            <w:pPr>
+              <w:jc w:val="center"/>
+            </w:pPr>
+            <w:r/>
+            <w:r>
+              <w:rPr>
+                <w:b w:val="0"/>
+                <w:sz w:val="16"/>
+              </w:rPr>
+              <w:t>1466</w:t>
+            </w:r>
+          </w:p>
+        </w:tc>
+      </w:tr>
+      <w:tr>
+        <w:tc>
+          <w:tcPr>
+            <w:tcW w:type="dxa" w:w="1700"/>
+            <w:vAlign w:val="center"/>
+            <w:shd w:fill="E7EAED"/>
+          </w:tcPr>
+          <w:p>
+            <w:pPr>
+              <w:jc w:val="center"/>
+            </w:pPr>
+            <w:r/>
+            <w:r>
+              <w:rPr>
+                <w:b w:val="0"/>
+                <w:sz w:val="16"/>
+              </w:rPr>
+              <w:t>06</w:t>
+            </w:r>
+          </w:p>
+        </w:tc>
+        <w:tc>
+          <w:tcPr>
+            <w:tcW w:type="dxa" w:w="1700"/>
+            <w:vAlign w:val="center"/>
+            <w:shd w:fill="E7EAED"/>
+          </w:tcPr>
+          <w:p>
+            <w:pPr>
+              <w:jc w:val="center"/>
+            </w:pPr>
+            <w:r/>
+            <w:r>
+              <w:rPr>
+                <w:b w:val="0"/>
+                <w:sz w:val="16"/>
+              </w:rPr>
+              <w:t>SALICON saliency</w:t>
+            </w:r>
+          </w:p>
+        </w:tc>
+        <w:tc>
+          <w:tcPr>
+            <w:tcW w:type="dxa" w:w="1700"/>
+            <w:vAlign w:val="center"/>
+            <w:shd w:fill="E7EAED"/>
+          </w:tcPr>
+          <w:p>
+            <w:pPr>
+              <w:jc w:val="center"/>
+            </w:pPr>
+            <w:r/>
+            <w:r>
+              <w:rPr>
+                <w:b w:val="0"/>
+                <w:sz w:val="16"/>
+              </w:rPr>
+              <w:t>64.282</w:t>
+            </w:r>
+          </w:p>
+        </w:tc>
+        <w:tc>
+          <w:tcPr>
+            <w:tcW w:type="dxa" w:w="1700"/>
+            <w:vAlign w:val="center"/>
+            <w:shd w:fill="E7EAED"/>
+          </w:tcPr>
+          <w:p>
+            <w:pPr>
+              <w:jc w:val="center"/>
+            </w:pPr>
+            <w:r/>
+            <w:r>
+              <w:rPr>
+                <w:b w:val="0"/>
+                <w:sz w:val="16"/>
+              </w:rPr>
+              <w:t>338.2</w:t>
+            </w:r>
+          </w:p>
+        </w:tc>
+        <w:tc>
+          <w:tcPr>
+            <w:tcW w:type="dxa" w:w="1700"/>
+            <w:vAlign w:val="center"/>
+            <w:shd w:fill="E7EAED"/>
+          </w:tcPr>
+          <w:p>
+            <w:pPr>
+              <w:jc w:val="center"/>
+            </w:pPr>
+            <w:r/>
+            <w:r>
+              <w:rPr>
+                <w:b w:val="0"/>
+                <w:sz w:val="16"/>
+              </w:rPr>
+              <w:t>402.482</w:t>
+            </w:r>
+          </w:p>
+        </w:tc>
+        <w:tc>
+          <w:tcPr>
+            <w:tcW w:type="dxa" w:w="1700"/>
+            <w:vAlign w:val="center"/>
+            <w:shd w:fill="E7EAED"/>
+          </w:tcPr>
+          <w:p>
+            <w:pPr>
+              <w:jc w:val="center"/>
+            </w:pPr>
+            <w:r/>
+            <w:r>
+              <w:rPr>
+                <w:b w:val="0"/>
+                <w:sz w:val="16"/>
+              </w:rPr>
+              <w:t>1460</w:t>
+            </w:r>
+          </w:p>
+        </w:tc>
+      </w:tr>
+      <w:tr>
+        <w:tc>
+          <w:tcPr>
+            <w:tcW w:type="dxa" w:w="1700"/>
+            <w:vAlign w:val="center"/>
+            <w:shd w:fill="DCECF7"/>
+          </w:tcPr>
+          <w:p>
+            <w:pPr>
+              <w:jc w:val="center"/>
+            </w:pPr>
+            <w:r/>
+            <w:r>
+              <w:rPr>
+                <w:b w:val="0"/>
+                <w:sz w:val="16"/>
+              </w:rPr>
+              <w:t>07</w:t>
+            </w:r>
+          </w:p>
+        </w:tc>
+        <w:tc>
+          <w:tcPr>
+            <w:tcW w:type="dxa" w:w="1700"/>
+            <w:vAlign w:val="center"/>
+            <w:shd w:fill="DCECF7"/>
+          </w:tcPr>
+          <w:p>
+            <w:pPr>
+              <w:jc w:val="center"/>
+            </w:pPr>
+            <w:r/>
+            <w:r>
+              <w:rPr>
+                <w:b w:val="0"/>
+                <w:sz w:val="16"/>
+              </w:rPr>
+              <w:t>OpenMoji semantic interaction</w:t>
+            </w:r>
+          </w:p>
+        </w:tc>
+        <w:tc>
+          <w:tcPr>
+            <w:tcW w:type="dxa" w:w="1700"/>
+            <w:vAlign w:val="center"/>
+            <w:shd w:fill="DCECF7"/>
+          </w:tcPr>
+          <w:p>
+            <w:pPr>
+              <w:jc w:val="center"/>
+            </w:pPr>
+            <w:r/>
+            <w:r>
+              <w:rPr>
+                <w:b w:val="0"/>
+                <w:sz w:val="16"/>
+              </w:rPr>
+              <w:t>79.730</w:t>
+            </w:r>
+          </w:p>
+        </w:tc>
+        <w:tc>
+          <w:tcPr>
+            <w:tcW w:type="dxa" w:w="1700"/>
+            <w:vAlign w:val="center"/>
+            <w:shd w:fill="DCECF7"/>
+          </w:tcPr>
+          <w:p>
+            <w:pPr>
+              <w:jc w:val="center"/>
+            </w:pPr>
+            <w:r/>
+            <w:r>
+              <w:rPr>
+                <w:b w:val="0"/>
+                <w:sz w:val="16"/>
+              </w:rPr>
+              <w:t>338.2</w:t>
+            </w:r>
+          </w:p>
+        </w:tc>
+        <w:tc>
+          <w:tcPr>
+            <w:tcW w:type="dxa" w:w="1700"/>
+            <w:vAlign w:val="center"/>
+            <w:shd w:fill="DCECF7"/>
+          </w:tcPr>
+          <w:p>
+            <w:pPr>
+              <w:jc w:val="center"/>
+            </w:pPr>
+            <w:r/>
+            <w:r>
+              <w:rPr>
+                <w:b w:val="0"/>
+                <w:sz w:val="16"/>
+              </w:rPr>
+              <w:t>417.930</w:t>
+            </w:r>
+          </w:p>
+        </w:tc>
+        <w:tc>
+          <w:tcPr>
+            <w:tcW w:type="dxa" w:w="1700"/>
+            <w:vAlign w:val="center"/>
+            <w:shd w:fill="DCECF7"/>
+          </w:tcPr>
+          <w:p>
+            <w:pPr>
+              <w:jc w:val="center"/>
+            </w:pPr>
+            <w:r/>
+            <w:r>
+              <w:rPr>
+                <w:b w:val="0"/>
+                <w:sz w:val="16"/>
+              </w:rPr>
+              <w:t>1458</w:t>
+            </w:r>
+          </w:p>
+        </w:tc>
+      </w:tr>
+    </w:tbl>
+    <w:p>
+      <w:r>
+        <w:t>七行任务的 A100 活跃均值作不加权算术平均为 67.852 W；与固定机箱 338.2 W 相加为 406.052 W。该跨任务均值仅便于总览；正式能量逐任务使用各自 A100 active mean。</w:t>
       </w:r>
     </w:p>
     <w:p>
@@ -2463,7 +3473,7 @@
     </w:p>
     <w:p>
       <w:r>
-        <w:t>LSP 的红框展示值 0.7353 尚未找到可严格绑定的结果文件；当前可追溯的 Ours 完整测试结果为 0.7347857143。为避免学术性替换，本报告保留精确绑定值。OpenMoji 基线固定为新布局 0.8120，不混用旧结果 0.8420。</w:t>
+        <w:t>LSP 使用实验室服务器绑定的完整测试结果 0.7347857143。OpenMoji 基线固定为新布局 0.8120，不混用旧结果 0.8420。</w:t>
       </w:r>
     </w:p>
     <w:p>

</xml_diff>